<commit_message>
added data analysis with python
</commit_message>
<xml_diff>
--- a/Hellooo.docx
+++ b/Hellooo.docx
@@ -3,13 +3,14 @@
 <w:document xmlns:wpc="http://schemas.microsoft.com/office/word/2010/wordprocessingCanvas" xmlns:cx="http://schemas.microsoft.com/office/drawing/2014/chartex" xmlns:cx1="http://schemas.microsoft.com/office/drawing/2015/9/8/chartex" xmlns:cx2="http://schemas.microsoft.com/office/drawing/2015/10/21/chartex" xmlns:cx3="http://schemas.microsoft.com/office/drawing/2016/5/9/chartex" xmlns:cx4="http://schemas.microsoft.com/office/drawing/2016/5/10/chartex" xmlns:cx5="http://schemas.microsoft.com/office/drawing/2016/5/11/chartex" xmlns:cx6="http://schemas.microsoft.com/office/drawing/2016/5/12/chartex" xmlns:cx7="http://schemas.microsoft.com/office/drawing/2016/5/13/chartex" xmlns:cx8="http://schemas.microsoft.com/office/drawing/2016/5/14/chartex" xmlns:mc="http://schemas.openxmlformats.org/markup-compatibility/2006" xmlns:aink="http://schemas.microsoft.com/office/drawing/2016/ink" xmlns:am3d="http://schemas.microsoft.com/office/drawing/2017/model3d" xmlns:o="urn:schemas-microsoft-com:office:office" xmlns:oel="http://schemas.microsoft.com/office/2019/extlst" xmlns:r="http://schemas.openxmlformats.org/officeDocument/2006/relationships" xmlns:m="http://schemas.openxmlformats.org/officeDocument/2006/math" xmlns:v="urn:schemas-microsoft-com:vml" xmlns:wp14="http://schemas.microsoft.com/office/word/2010/wordprocessingDrawing" xmlns:wp="http://schemas.openxmlformats.org/drawingml/2006/wordprocessingDrawing" xmlns:w10="urn:schemas-microsoft-com:office:word" xmlns:w="http://schemas.openxmlformats.org/wordprocessingml/2006/main" xmlns:w14="http://schemas.microsoft.com/office/word/2010/wordml" xmlns:w15="http://schemas.microsoft.com/office/word/2012/wordml" xmlns:w16cex="http://schemas.microsoft.com/office/word/2018/wordml/cex" xmlns:w16cid="http://schemas.microsoft.com/office/word/2016/wordml/cid" xmlns:w16="http://schemas.microsoft.com/office/word/2018/wordml" xmlns:w16du="http://schemas.microsoft.com/office/word/2023/wordml/word16du" xmlns:w16sdtdh="http://schemas.microsoft.com/office/word/2020/wordml/sdtdatahash" xmlns:w16sdtfl="http://schemas.microsoft.com/office/word/2024/wordml/sdtformatlock" xmlns:w16se="http://schemas.microsoft.com/office/word/2015/wordml/symex" xmlns:wpg="http://schemas.microsoft.com/office/word/2010/wordprocessingGroup" xmlns:wpi="http://schemas.microsoft.com/office/word/2010/wordprocessingInk" xmlns:wne="http://schemas.microsoft.com/office/word/2006/wordml" xmlns:wps="http://schemas.microsoft.com/office/word/2010/wordprocessingShape" mc:Ignorable="w14 w15 w16se w16cid w16 w16cex w16sdtdh w16sdtfl w16du wp14">
   <w:body>
     <w:p>
-      <w:proofErr w:type="spellStart"/>
-      <w:r>
-        <w:t>Hellooo</w:t>
-      </w:r>
-      <w:proofErr w:type="spellEnd"/>
-      <w:r>
-        <w:t xml:space="preserve">, how’s it going? I’m Aman, and welcome to my GitHub portfolio </w:t>
+      <w:r>
+        <w:t>H</w:t>
+      </w:r>
+      <w:r>
+        <w:t xml:space="preserve">ello world! </w:t>
+      </w:r>
+      <w:r>
+        <w:t xml:space="preserve">I’m Aman, and welcome to my GitHub portfolio </w:t>
       </w:r>
       <w:r>
         <w:rPr>
@@ -32,20 +33,24 @@
     </w:p>
     <w:p>
       <w:r>
-        <w:t xml:space="preserve">I’m a recent Computer Science grad coming out of </w:t>
-      </w:r>
-      <w:proofErr w:type="spellStart"/>
-      <w:r>
-        <w:t>uni</w:t>
-      </w:r>
-      <w:proofErr w:type="spellEnd"/>
+        <w:t>I’m a recent Computer Science grad</w:t>
+      </w:r>
+      <w:r>
+        <w:t>uate</w:t>
+      </w:r>
+      <w:r>
+        <w:t xml:space="preserve"> coming out of uni</w:t>
+      </w:r>
+      <w:r>
+        <w:t>versity</w:t>
+      </w:r>
       <w:r>
         <w:t xml:space="preserve"> with 3 years of industry experience, who has built a deep passion for software engineering, consulting, data analytics and cloud technology.</w:t>
       </w:r>
     </w:p>
     <w:p>
       <w:r>
-        <w:t>Here, you’ll be able to view my highlight projects that I’ve been able to produce ranging from Year 13, up until my final year of university. Some projects are academic, while others where during my industry experience, which I was ablet to obtain 3 years of whilst at uni. I hope you find some interest in them!</w:t>
+        <w:t>Here, you’ll be able to view my highlight projects that I’ve been able to produce ranging from Year 13, up until my final year of university. Some projects are academic, while others where during my industry experience. I hope you find some interest in them!</w:t>
       </w:r>
       <w:r>
         <w:t xml:space="preserve"> I’ve also included some coding challenges I’ve been able to so solve, and projects from certificates I’ve had to do to attain (currently have one, but more to come!). </w:t>
@@ -77,16 +82,8 @@
           <w:ilvl w:val="0"/>
           <w:numId w:val="1"/>
         </w:numPr>
-        <w:rPr>
-          <w:b/>
-          <w:bCs/>
-        </w:rPr>
-      </w:pPr>
-      <w:r>
-        <w:rPr>
-          <w:b/>
-          <w:bCs/>
-        </w:rPr>
+      </w:pPr>
+      <w:r>
         <w:t>Barber Booking System</w:t>
       </w:r>
     </w:p>
@@ -112,6 +109,9 @@
       </w:pPr>
       <w:r>
         <w:t>Coffee Roulette</w:t>
+      </w:r>
+      <w:r>
+        <w:t xml:space="preserve"> Script</w:t>
       </w:r>
     </w:p>
     <w:p>

</xml_diff>